<commit_message>
docs: remove alarms feature references from database scripts, diagrams and documentation
</commit_message>
<xml_diff>
--- a/docs/Documento Técnico del Proyecto de Software.docx
+++ b/docs/Documento Técnico del Proyecto de Software.docx
@@ -2074,7 +2074,7 @@
           <w:szCs w:val="24"/>
           <w:lang w:val="es-MX"/>
         </w:rPr>
-        <w:t xml:space="preserve">Sistema de notificaciones y alarmas visuales. </w:t>
+        <w:t xml:space="preserve">Sistema de notificaciones visuales. </w:t>
       </w:r>
     </w:p>
     <w:p>
@@ -2657,16 +2657,7 @@
           <w:szCs w:val="24"/>
           <w:lang w:val="es-MX"/>
         </w:rPr>
-        <w:t>Notificaciones y alarmas:</w:t>
-      </w:r>
-      <w:r>
-        <w:rPr>
-          <w:rFonts w:eastAsia="Aptos"/>
-          <w:sz w:val="24"/>
-          <w:szCs w:val="24"/>
-          <w:lang w:val="es-MX"/>
-        </w:rPr>
-        <w:t xml:space="preserve"> gestionadas mediante patrones Observer. </w:t>
+        <w:t xml:space="preserve">Notificaciones: gestionadas mediante el patrón Observer. </w:t>
       </w:r>
     </w:p>
     <w:p>
@@ -4281,29 +4272,6 @@
           <w:lang w:val="es-MX"/>
         </w:rPr>
         <w:t xml:space="preserve">Consultar historial </w:t>
-      </w:r>
-    </w:p>
-    <w:p>
-      <w:pPr>
-        <w:pStyle w:val="Prrafodelista"/>
-        <w:widowControl/>
-        <w:numPr>
-          <w:ilvl w:val="0"/>
-          <w:numId w:val="12"/>
-        </w:numPr>
-        <w:spacing w:line="279" w:lineRule="auto"/>
-        <w:rPr>
-          <w:rFonts w:eastAsia="Aptos"/>
-        </w:rPr>
-      </w:pPr>
-      <w:r>
-        <w:rPr>
-          <w:rFonts w:eastAsia="Aptos"/>
-          <w:sz w:val="24"/>
-          <w:szCs w:val="24"/>
-          <w:lang w:val="es-MX"/>
-        </w:rPr>
-        <w:t xml:space="preserve">Configurar alarmas </w:t>
       </w:r>
     </w:p>
     <w:p>
@@ -8500,64 +8468,22 @@
         <w:spacing w:before="80" w:after="100"/>
       </w:pPr>
       <w:r>
-        <w:t xml:space="preserve">Cada acción relevante (guardar traducción, </w:t>
-      </w:r>
-      <w:proofErr w:type="spellStart"/>
-      <w:r>
-        <w:t>login</w:t>
-      </w:r>
-      <w:proofErr w:type="spellEnd"/>
-      <w:r>
-        <w:t xml:space="preserve">, cambio de perfil) es emitida por el </w:t>
-      </w:r>
-      <w:proofErr w:type="spellStart"/>
-      <w:r>
-        <w:t>GestorEventos</w:t>
-      </w:r>
-      <w:proofErr w:type="spellEnd"/>
-      <w:r>
-        <w:t xml:space="preserve">, que notifica automáticamente a los </w:t>
-      </w:r>
-      <w:proofErr w:type="spellStart"/>
-      <w:r>
-        <w:t>observers</w:t>
-      </w:r>
-      <w:proofErr w:type="spellEnd"/>
-      <w:r>
-        <w:t xml:space="preserve"> suscritos: </w:t>
-      </w:r>
-      <w:proofErr w:type="spellStart"/>
-      <w:r>
-        <w:t>EventoUsoObserver</w:t>
-      </w:r>
-      <w:proofErr w:type="spellEnd"/>
-      <w:r>
-        <w:t xml:space="preserve"> registra estadísticas, </w:t>
-      </w:r>
-      <w:proofErr w:type="spellStart"/>
-      <w:r>
-        <w:t>NotificacionObserver</w:t>
-      </w:r>
-      <w:proofErr w:type="spellEnd"/>
-      <w:r>
-        <w:t xml:space="preserve"> evalúa si enviar un </w:t>
-      </w:r>
-      <w:proofErr w:type="spellStart"/>
-      <w:r>
-        <w:t>push</w:t>
-      </w:r>
-      <w:proofErr w:type="spellEnd"/>
-      <w:r>
-        <w:t xml:space="preserve"> y </w:t>
-      </w:r>
-      <w:proofErr w:type="spellStart"/>
-      <w:r>
-        <w:t>AlarmaObserver</w:t>
-      </w:r>
-      <w:proofErr w:type="spellEnd"/>
-      <w:r>
-        <w:t xml:space="preserve"> gestiona alertas visuales programadas.</w:t>
-      </w:r>
+        <w:t>Cada acción relevante (guardar traducción, login, cambio de perfil) es emitida por el GestorEventos, que notifica automáticamente a los observers suscritos: EventoUsoObserver registra estadísticas y NotificacionObserver evalúa si enviar un push.</w:t>
+      </w:r>
+      <w:proofErr w:type="spellStart"/>
+      <w:proofErr w:type="spellEnd"/>
+      <w:proofErr w:type="spellStart"/>
+      <w:proofErr w:type="spellEnd"/>
+      <w:proofErr w:type="spellStart"/>
+      <w:proofErr w:type="spellEnd"/>
+      <w:proofErr w:type="spellStart"/>
+      <w:proofErr w:type="spellEnd"/>
+      <w:proofErr w:type="spellStart"/>
+      <w:proofErr w:type="spellEnd"/>
+      <w:proofErr w:type="spellStart"/>
+      <w:proofErr w:type="spellEnd"/>
+      <w:proofErr w:type="spellStart"/>
+      <w:proofErr w:type="spellEnd"/>
     </w:p>
     <w:p>
       <w:pPr>
@@ -9788,56 +9714,14 @@
                 <w:sz w:val="20"/>
                 <w:szCs w:val="20"/>
               </w:rPr>
-              <w:t>GestorEventos</w:t>
+              <w:t>GestorEventos, NotificacionObserver, EventoUsoObserver</w:t>
             </w:r>
             <w:proofErr w:type="spellEnd"/>
-            <w:r>
-              <w:rPr>
-                <w:sz w:val="20"/>
-                <w:szCs w:val="20"/>
-              </w:rPr>
-              <w:t xml:space="preserve">, </w:t>
-            </w:r>
             <w:proofErr w:type="spellStart"/>
-            <w:r>
-              <w:rPr>
-                <w:sz w:val="20"/>
-                <w:szCs w:val="20"/>
-              </w:rPr>
-              <w:t>NotificacionObserver</w:t>
-            </w:r>
             <w:proofErr w:type="spellEnd"/>
-            <w:r>
-              <w:rPr>
-                <w:sz w:val="20"/>
-                <w:szCs w:val="20"/>
-              </w:rPr>
-              <w:t xml:space="preserve">, </w:t>
-            </w:r>
             <w:proofErr w:type="spellStart"/>
-            <w:r>
-              <w:rPr>
-                <w:sz w:val="20"/>
-                <w:szCs w:val="20"/>
-              </w:rPr>
-              <w:t>AlarmaObserver</w:t>
-            </w:r>
             <w:proofErr w:type="spellEnd"/>
-            <w:r>
-              <w:rPr>
-                <w:sz w:val="20"/>
-                <w:szCs w:val="20"/>
-              </w:rPr>
-              <w:t xml:space="preserve">, </w:t>
-            </w:r>
             <w:proofErr w:type="spellStart"/>
-            <w:r>
-              <w:rPr>
-                <w:sz w:val="20"/>
-                <w:szCs w:val="20"/>
-              </w:rPr>
-              <w:t>EventoUsoObserver</w:t>
-            </w:r>
             <w:proofErr w:type="spellEnd"/>
           </w:p>
         </w:tc>
@@ -10126,7 +10010,7 @@
       </w:r>
       <w:proofErr w:type="spellEnd"/>
       <w:r>
-        <w:t>) y dos tipos de notificación (</w:t>
+        <w:t>) y un tipo de notificación (</w:t>
       </w:r>
       <w:proofErr w:type="spellStart"/>
       <w:r>
@@ -10134,7 +10018,7 @@
       </w:r>
       <w:proofErr w:type="spellEnd"/>
       <w:r>
-        <w:t xml:space="preserve"> y alarma). Sin este patrón, cada pantalla necesitaría condicionales </w:t>
+        <w:t xml:space="preserve">). Sin este patrón, cada pantalla necesitaría condicionales </w:t>
       </w:r>
       <w:proofErr w:type="spellStart"/>
       <w:r>
@@ -10189,15 +10073,13 @@
       </w:r>
       <w:proofErr w:type="spellEnd"/>
       <w:r>
-        <w:t xml:space="preserve"> notifique a todos los suscriptores sin que estén acoplados entre sí. Esto es especialmente crítico en una app para personas sordas, donde las alertas visuales inmediatas (</w:t>
-      </w:r>
-      <w:proofErr w:type="spellStart"/>
-      <w:r>
-        <w:t>AlarmaObserver</w:t>
-      </w:r>
-      <w:proofErr w:type="spellEnd"/>
-      <w:r>
-        <w:t>) son la principal forma de comunicación del sistema con el usuario.</w:t>
+        <w:t xml:space="preserve"> notifique a todos los suscriptores sin que estén acoplados entre sí. Esto es especialmente crítico en una app para personas sordas, donde las notificaciones visuales inmediatas </w:t>
+      </w:r>
+      <w:proofErr w:type="spellStart"/>
+      <w:r/>
+      <w:proofErr w:type="spellEnd"/>
+      <w:r>
+        <w:t>son la principal forma de comunicación del sistema con el usuario.</w:t>
       </w:r>
     </w:p>
     <w:p>
@@ -10930,41 +10812,6 @@
         <w:t>push</w:t>
       </w:r>
       <w:proofErr w:type="spellEnd"/>
-    </w:p>
-    <w:p>
-      <w:pPr>
-        <w:spacing w:before="60" w:after="60"/>
-        <w:ind w:left="720"/>
-      </w:pPr>
-      <w:r>
-        <w:rPr>
-          <w:rFonts w:eastAsia="Courier New"/>
-          <w:color w:val="2C3E50"/>
-          <w:sz w:val="18"/>
-          <w:szCs w:val="18"/>
-        </w:rPr>
-        <w:t xml:space="preserve">// → </w:t>
-      </w:r>
-      <w:proofErr w:type="spellStart"/>
-      <w:r>
-        <w:rPr>
-          <w:rFonts w:eastAsia="Courier New"/>
-          <w:color w:val="2C3E50"/>
-          <w:sz w:val="18"/>
-          <w:szCs w:val="18"/>
-        </w:rPr>
-        <w:t>AlarmaObserver.actualizar</w:t>
-      </w:r>
-      <w:proofErr w:type="spellEnd"/>
-      <w:r>
-        <w:rPr>
-          <w:rFonts w:eastAsia="Courier New"/>
-          <w:color w:val="2C3E50"/>
-          <w:sz w:val="18"/>
-          <w:szCs w:val="18"/>
-        </w:rPr>
-        <w:t>() verifica alarmas relacionadas</w:t>
-      </w:r>
     </w:p>
     <w:p>
       <w:pPr>
@@ -11544,40 +11391,12 @@
                 <w:sz w:val="20"/>
                 <w:szCs w:val="20"/>
               </w:rPr>
-              <w:t xml:space="preserve">Convertir en Singleton clases que sí necesitan múltiples instancias, como </w:t>
+              <w:t>Convertir en Singleton clases que sí necesitan múltiples instancias, como Traduccion.</w:t>
             </w:r>
             <w:proofErr w:type="spellStart"/>
-            <w:r>
-              <w:rPr>
-                <w:sz w:val="20"/>
-                <w:szCs w:val="20"/>
-              </w:rPr>
-              <w:t>Traduccion</w:t>
-            </w:r>
             <w:proofErr w:type="spellEnd"/>
-            <w:r>
-              <w:rPr>
-                <w:sz w:val="20"/>
-                <w:szCs w:val="20"/>
-              </w:rPr>
-              <w:t xml:space="preserve"> o </w:t>
-            </w:r>
             <w:proofErr w:type="spellStart"/>
-            <w:r>
-              <w:rPr>
-                <w:sz w:val="20"/>
-                <w:szCs w:val="20"/>
-              </w:rPr>
-              <w:t>AlarmaObserver</w:t>
-            </w:r>
             <w:proofErr w:type="spellEnd"/>
-            <w:r>
-              <w:rPr>
-                <w:sz w:val="20"/>
-                <w:szCs w:val="20"/>
-              </w:rPr>
-              <w:t>.</w:t>
-            </w:r>
           </w:p>
         </w:tc>
         <w:tc>

</xml_diff>